<commit_message>
Update final Word DOCX renders and ensure all SVG images generated today are synced
</commit_message>
<xml_diff>
--- a/chapters/word_output/CH-000_Prefacio.docx
+++ b/chapters/word_output/CH-000_Prefacio.docx
@@ -1392,7 +1392,7 @@
           <w:szCs w:val="22"/>
           <w:rFonts w:ascii="Times New Roman" w:cs="Times New Roman" w:eastAsia="Times New Roman" w:hAnsi="Times New Roman"/>
         </w:rPr>
-        <w:t xml:space="preserve">Ao longo dos anos, aprendi que o conhecimento clínico, sozinho, não responde às perguntas que me interessam. Saber que um anel "funciona" não me basta — preciso entender </w:t>
+        <w:t xml:space="preserve">Ao longo dos anos, aprendemos que o conhecimento clínico, sozinho, não responde às perguntas que nos interessam. Saber que um anel "funciona" não nos basta — preciso entender </w:t>
       </w:r>
       <w:r>
         <w:rPr>
@@ -1452,7 +1452,7 @@
           <w:szCs w:val="22"/>
           <w:rFonts w:ascii="Times New Roman" w:cs="Times New Roman" w:eastAsia="Times New Roman" w:hAnsi="Times New Roman"/>
         </w:rPr>
-        <w:t xml:space="preserve"> prever o resultado antes de operar. Para isso, precisei navegar em territórios que poucos cirurgiões visitam:</w:t>
+        <w:t xml:space="preserve"> prever o resultado antes de operar. Para isso, precisamos navegar em territórios que poucos cirurgiões visitam:</w:t>
       </w:r>
     </w:p>
     <w:p>
@@ -2103,7 +2103,7 @@
           <w:szCs w:val="22"/>
           <w:rFonts w:ascii="Times New Roman" w:cs="Times New Roman" w:eastAsia="Times New Roman" w:hAnsi="Times New Roman"/>
         </w:rPr>
-        <w:t xml:space="preserve">Para o cirurgião que quer entender por que implanta o que implanta. Para o fellow que quer um framework para pensar sobre anéis em vez de apenas seguir tabelas. Para o pesquisador que procura hipóteses testáveis na interface entre biomecânica e cirurgia refrativa. E para quem, como eu, acredita que a geometria escondida dentro da córnea tem muito mais a nos ensinar.</w:t>
+        <w:t xml:space="preserve">Para o cirurgião que quer entender por que implanta o que implanta. Para o fellow que quer um framework para pensar sobre anéis em vez de apenas seguir tabelas. Para o pesquisador que procura hipóteses testáveis na interface entre biomecânica e cirurgia refrativa. E para quem, como nós, acredita que a geometria escondida dentro da córnea tem muito mais a nos ensinar.</w:t>
       </w:r>
     </w:p>
     <w:p>

</xml_diff>